<commit_message>
Actualiza estrategia de liderazgo QA
</commit_message>
<xml_diff>
--- a/Estrategia_Liderazgo_QA_HelpPeople.docx
+++ b/Estrategia_Liderazgo_QA_HelpPeople.docx
@@ -1136,23 +1136,7 @@
         <w:t xml:space="preserve">Comunicación: </w:t>
       </w:r>
       <w:r>
-        <w:t xml:space="preserve">resumir evidencia, impacto potencial, incertidumbre, opciones, recomendación, responsable de decisión y riesgo residual; registrar la decisión y no afirmar que el producto </w:t>
-      </w:r>
-      <w:proofErr w:type="spellStart"/>
-      <w:r>
-        <w:t>está</w:t>
-      </w:r>
-      <w:proofErr w:type="spellEnd"/>
-      <w:r>
-        <w:t xml:space="preserve"> libre de </w:t>
-      </w:r>
-      <w:proofErr w:type="spellStart"/>
-      <w:r>
-        <w:t>defectos</w:t>
-      </w:r>
-      <w:proofErr w:type="spellEnd"/>
-      <w:r>
-        <w:t>.</w:t>
+        <w:t>resumir evidencia, impacto potencial, incertidumbre, opciones, recomendación, responsable de decisión y riesgo residual; registrar la decisión y no afirmar que el producto está libre de defectos.</w:t>
       </w:r>
     </w:p>
     <w:p>
@@ -1190,49 +1174,7 @@
         <w:rPr>
           <w:lang w:val="es-ES"/>
         </w:rPr>
-        <w:t xml:space="preserve">La siguiente matriz indica qué evidencia debe adjuntarse por caso. Son </w:t>
-      </w:r>
-      <w:proofErr w:type="gramStart"/>
-      <w:r>
-        <w:rPr>
-          <w:lang w:val="es-ES"/>
-        </w:rPr>
-        <w:t>evidencias a generar</w:t>
-      </w:r>
-      <w:proofErr w:type="gramEnd"/>
-      <w:r>
-        <w:rPr>
-          <w:lang w:val="es-ES"/>
-        </w:rPr>
-        <w:t xml:space="preserve">/organizar con ejecuciones reales; la tabla no afirma por sí sola que las capturas ya existan. Guardar las capturas aprobadas en </w:t>
-      </w:r>
-      <w:proofErr w:type="spellStart"/>
-      <w:r>
-        <w:rPr>
-          <w:lang w:val="es-ES"/>
-        </w:rPr>
-        <w:t>evidence</w:t>
-      </w:r>
-      <w:proofErr w:type="spellEnd"/>
-      <w:r>
-        <w:rPr>
-          <w:lang w:val="es-ES"/>
-        </w:rPr>
-        <w:t xml:space="preserve">/ y conservar el reporte HTML y las trazas generadas por </w:t>
-      </w:r>
-      <w:proofErr w:type="spellStart"/>
-      <w:r>
-        <w:rPr>
-          <w:lang w:val="es-ES"/>
-        </w:rPr>
-        <w:t>Playwright</w:t>
-      </w:r>
-      <w:proofErr w:type="spellEnd"/>
-      <w:r>
-        <w:rPr>
-          <w:lang w:val="es-ES"/>
-        </w:rPr>
-        <w:t>.</w:t>
+        <w:t>La siguiente matriz indica qué evidencia debe adjuntarse por caso. Son evidencias a generar/organizar con ejecuciones reales; la tabla no afirma por sí sola que las capturas ya existan. Guardar las capturas aprobadas en evidence/ y conservar el reporte HTML y las trazas generadas por Playwright.</w:t>
       </w:r>
     </w:p>
     <w:tbl>
@@ -1382,47 +1324,7 @@
               <w:spacing w:before="40"/>
             </w:pPr>
             <w:r>
-              <w:t xml:space="preserve">El </w:t>
-            </w:r>
-            <w:proofErr w:type="spellStart"/>
-            <w:r>
-              <w:t>inicio</w:t>
-            </w:r>
-            <w:proofErr w:type="spellEnd"/>
-            <w:r>
-              <w:t xml:space="preserve"> de </w:t>
-            </w:r>
-            <w:proofErr w:type="spellStart"/>
-            <w:r>
-              <w:t>sesión</w:t>
-            </w:r>
-            <w:proofErr w:type="spellEnd"/>
-            <w:r>
-              <w:t xml:space="preserve"> </w:t>
-            </w:r>
-            <w:proofErr w:type="spellStart"/>
-            <w:r>
-              <w:t>válido</w:t>
-            </w:r>
-            <w:proofErr w:type="spellEnd"/>
-            <w:r>
-              <w:t xml:space="preserve"> </w:t>
-            </w:r>
-            <w:proofErr w:type="spellStart"/>
-            <w:r>
-              <w:t>llega</w:t>
-            </w:r>
-            <w:proofErr w:type="spellEnd"/>
-            <w:r>
-              <w:t xml:space="preserve"> al </w:t>
-            </w:r>
-            <w:proofErr w:type="spellStart"/>
-            <w:r>
-              <w:t>catálogo</w:t>
-            </w:r>
-            <w:proofErr w:type="spellEnd"/>
-            <w:r>
-              <w:t>.</w:t>
+              <w:t>El inicio de sesión válido llega al catálogo.</w:t>
             </w:r>
           </w:p>
         </w:tc>
@@ -1437,21 +1339,8 @@
               <w:spacing w:before="40"/>
             </w:pPr>
             <w:r>
-              <w:t xml:space="preserve">QA02 · </w:t>
+              <w:t>QA02 · Usuario bloqueado</w:t>
             </w:r>
-            <w:proofErr w:type="spellStart"/>
-            <w:r>
-              <w:t>Usuario</w:t>
-            </w:r>
-            <w:proofErr w:type="spellEnd"/>
-            <w:r>
-              <w:t xml:space="preserve"> </w:t>
-            </w:r>
-            <w:proofErr w:type="spellStart"/>
-            <w:r>
-              <w:t>bloqueado</w:t>
-            </w:r>
-            <w:proofErr w:type="spellEnd"/>
           </w:p>
         </w:tc>
         <w:tc>
@@ -1513,39 +1402,7 @@
               <w:spacing w:before="40"/>
             </w:pPr>
             <w:r>
-              <w:t xml:space="preserve">El </w:t>
-            </w:r>
-            <w:proofErr w:type="spellStart"/>
-            <w:r>
-              <w:t>acceso</w:t>
-            </w:r>
-            <w:proofErr w:type="spellEnd"/>
-            <w:r>
-              <w:t xml:space="preserve"> es </w:t>
-            </w:r>
-            <w:proofErr w:type="spellStart"/>
-            <w:r>
-              <w:t>rechazado</w:t>
-            </w:r>
-            <w:proofErr w:type="spellEnd"/>
-            <w:r>
-              <w:t xml:space="preserve"> y se </w:t>
-            </w:r>
-            <w:proofErr w:type="spellStart"/>
-            <w:r>
-              <w:t>informa</w:t>
-            </w:r>
-            <w:proofErr w:type="spellEnd"/>
-            <w:r>
-              <w:t xml:space="preserve"> el </w:t>
-            </w:r>
-            <w:proofErr w:type="spellStart"/>
-            <w:r>
-              <w:t>motivo</w:t>
-            </w:r>
-            <w:proofErr w:type="spellEnd"/>
-            <w:r>
-              <w:t>.</w:t>
+              <w:t>El acceso es rechazado y se informa el motivo.</w:t>
             </w:r>
           </w:p>
         </w:tc>
@@ -1560,13 +1417,8 @@
               <w:spacing w:before="40"/>
             </w:pPr>
             <w:r>
-              <w:t xml:space="preserve">QA03 · Compra </w:t>
+              <w:t>QA03 · Compra exitosa</w:t>
             </w:r>
-            <w:proofErr w:type="spellStart"/>
-            <w:r>
-              <w:t>exitosa</w:t>
-            </w:r>
-            <w:proofErr w:type="spellEnd"/>
           </w:p>
         </w:tc>
         <w:tc>
@@ -1628,47 +1480,7 @@
               <w:spacing w:before="40"/>
             </w:pPr>
             <w:r>
-              <w:t xml:space="preserve">La </w:t>
-            </w:r>
-            <w:proofErr w:type="spellStart"/>
-            <w:r>
-              <w:t>compra</w:t>
-            </w:r>
-            <w:proofErr w:type="spellEnd"/>
-            <w:r>
-              <w:t xml:space="preserve"> </w:t>
-            </w:r>
-            <w:proofErr w:type="spellStart"/>
-            <w:r>
-              <w:t>llega</w:t>
-            </w:r>
-            <w:proofErr w:type="spellEnd"/>
-            <w:r>
-              <w:t xml:space="preserve"> a la </w:t>
-            </w:r>
-            <w:proofErr w:type="spellStart"/>
-            <w:r>
-              <w:t>confirmación</w:t>
-            </w:r>
-            <w:proofErr w:type="spellEnd"/>
-            <w:r>
-              <w:t xml:space="preserve"> visible. No </w:t>
-            </w:r>
-            <w:proofErr w:type="spellStart"/>
-            <w:r>
-              <w:t>demuestra</w:t>
-            </w:r>
-            <w:proofErr w:type="spellEnd"/>
-            <w:r>
-              <w:t xml:space="preserve"> </w:t>
-            </w:r>
-            <w:proofErr w:type="spellStart"/>
-            <w:r>
-              <w:t>persistencia</w:t>
-            </w:r>
-            <w:proofErr w:type="spellEnd"/>
-            <w:r>
-              <w:t xml:space="preserve"> backend.</w:t>
+              <w:t>La compra llega a la confirmación visible. No demuestra persistencia backend.</w:t>
             </w:r>
           </w:p>
         </w:tc>
@@ -1683,13 +1495,8 @@
               <w:spacing w:before="40"/>
             </w:pPr>
             <w:r>
-              <w:t xml:space="preserve">QA04 · Campos </w:t>
+              <w:t>QA04 · Campos obligatorios</w:t>
             </w:r>
-            <w:proofErr w:type="spellStart"/>
-            <w:r>
-              <w:t>obligatorios</w:t>
-            </w:r>
-            <w:proofErr w:type="spellEnd"/>
           </w:p>
         </w:tc>
         <w:tc>
@@ -1751,47 +1558,7 @@
               <w:spacing w:before="40"/>
             </w:pPr>
             <w:r>
-              <w:t xml:space="preserve">El </w:t>
-            </w:r>
-            <w:proofErr w:type="spellStart"/>
-            <w:r>
-              <w:t>sistema</w:t>
-            </w:r>
-            <w:proofErr w:type="spellEnd"/>
-            <w:r>
-              <w:t xml:space="preserve"> </w:t>
-            </w:r>
-            <w:proofErr w:type="spellStart"/>
-            <w:r>
-              <w:t>impide</w:t>
-            </w:r>
-            <w:proofErr w:type="spellEnd"/>
-            <w:r>
-              <w:t xml:space="preserve"> </w:t>
-            </w:r>
-            <w:proofErr w:type="spellStart"/>
-            <w:r>
-              <w:t>continuar</w:t>
-            </w:r>
-            <w:proofErr w:type="spellEnd"/>
-            <w:r>
-              <w:t xml:space="preserve"> con </w:t>
-            </w:r>
-            <w:proofErr w:type="spellStart"/>
-            <w:r>
-              <w:t>información</w:t>
-            </w:r>
-            <w:proofErr w:type="spellEnd"/>
-            <w:r>
-              <w:t xml:space="preserve"> </w:t>
-            </w:r>
-            <w:proofErr w:type="spellStart"/>
-            <w:r>
-              <w:t>incompleta</w:t>
-            </w:r>
-            <w:proofErr w:type="spellEnd"/>
-            <w:r>
-              <w:t>.</w:t>
+              <w:t>El sistema impide continuar con información incompleta.</w:t>
             </w:r>
           </w:p>
         </w:tc>
@@ -1807,13 +1574,8 @@
             </w:pPr>
             <w:r>
               <w:lastRenderedPageBreak/>
-              <w:t xml:space="preserve">QA05 · Retiro del </w:t>
+              <w:t>QA05 · Retiro del carrito</w:t>
             </w:r>
-            <w:proofErr w:type="spellStart"/>
-            <w:r>
-              <w:t>carrito</w:t>
-            </w:r>
-            <w:proofErr w:type="spellEnd"/>
           </w:p>
         </w:tc>
         <w:tc>
@@ -1875,55 +1637,7 @@
               <w:spacing w:before="40"/>
             </w:pPr>
             <w:r>
-              <w:t xml:space="preserve">El </w:t>
-            </w:r>
-            <w:proofErr w:type="spellStart"/>
-            <w:r>
-              <w:t>elemento</w:t>
-            </w:r>
-            <w:proofErr w:type="spellEnd"/>
-            <w:r>
-              <w:t xml:space="preserve"> </w:t>
-            </w:r>
-            <w:proofErr w:type="spellStart"/>
-            <w:r>
-              <w:t>retirado</w:t>
-            </w:r>
-            <w:proofErr w:type="spellEnd"/>
-            <w:r>
-              <w:t xml:space="preserve"> </w:t>
-            </w:r>
-            <w:proofErr w:type="spellStart"/>
-            <w:r>
-              <w:t>ya</w:t>
-            </w:r>
-            <w:proofErr w:type="spellEnd"/>
-            <w:r>
-              <w:t xml:space="preserve"> no </w:t>
-            </w:r>
-            <w:proofErr w:type="spellStart"/>
-            <w:r>
-              <w:t>figura</w:t>
-            </w:r>
-            <w:proofErr w:type="spellEnd"/>
-            <w:r>
-              <w:t xml:space="preserve"> </w:t>
-            </w:r>
-            <w:proofErr w:type="spellStart"/>
-            <w:r>
-              <w:t>en</w:t>
-            </w:r>
-            <w:proofErr w:type="spellEnd"/>
-            <w:r>
-              <w:t xml:space="preserve"> el </w:t>
-            </w:r>
-            <w:proofErr w:type="spellStart"/>
-            <w:r>
-              <w:t>carrito</w:t>
-            </w:r>
-            <w:proofErr w:type="spellEnd"/>
-            <w:r>
-              <w:t>.</w:t>
+              <w:t>El elemento retirado ya no figura en el carrito.</w:t>
             </w:r>
           </w:p>
         </w:tc>
@@ -1938,13 +1652,8 @@
               <w:spacing w:before="40"/>
             </w:pPr>
             <w:r>
-              <w:t xml:space="preserve">QA06 · </w:t>
+              <w:t>QA06 · Ordenamiento</w:t>
             </w:r>
-            <w:proofErr w:type="spellStart"/>
-            <w:r>
-              <w:t>Ordenamiento</w:t>
-            </w:r>
-            <w:proofErr w:type="spellEnd"/>
           </w:p>
         </w:tc>
         <w:tc>
@@ -2006,63 +1715,7 @@
               <w:spacing w:before="40"/>
             </w:pPr>
             <w:r>
-              <w:t xml:space="preserve">El </w:t>
-            </w:r>
-            <w:proofErr w:type="spellStart"/>
-            <w:r>
-              <w:t>ordenamiento</w:t>
-            </w:r>
-            <w:proofErr w:type="spellEnd"/>
-            <w:r>
-              <w:t xml:space="preserve"> </w:t>
-            </w:r>
-            <w:proofErr w:type="spellStart"/>
-            <w:r>
-              <w:t>devuelve</w:t>
-            </w:r>
-            <w:proofErr w:type="spellEnd"/>
-            <w:r>
-              <w:t xml:space="preserve"> </w:t>
-            </w:r>
-            <w:proofErr w:type="spellStart"/>
-            <w:r>
-              <w:t>los</w:t>
-            </w:r>
-            <w:proofErr w:type="spellEnd"/>
-            <w:r>
-              <w:t xml:space="preserve"> </w:t>
-            </w:r>
-            <w:proofErr w:type="spellStart"/>
-            <w:r>
-              <w:t>productos</w:t>
-            </w:r>
-            <w:proofErr w:type="spellEnd"/>
-            <w:r>
-              <w:t xml:space="preserve"> </w:t>
-            </w:r>
-            <w:proofErr w:type="spellStart"/>
-            <w:r>
-              <w:t>en</w:t>
-            </w:r>
-            <w:proofErr w:type="spellEnd"/>
-            <w:r>
-              <w:t xml:space="preserve"> el </w:t>
-            </w:r>
-            <w:proofErr w:type="spellStart"/>
-            <w:r>
-              <w:t>orden</w:t>
-            </w:r>
-            <w:proofErr w:type="spellEnd"/>
-            <w:r>
-              <w:t xml:space="preserve"> </w:t>
-            </w:r>
-            <w:proofErr w:type="spellStart"/>
-            <w:r>
-              <w:t>esperado</w:t>
-            </w:r>
-            <w:proofErr w:type="spellEnd"/>
-            <w:r>
-              <w:t>.</w:t>
+              <w:t>El ordenamiento devuelve los productos en el orden esperado.</w:t>
             </w:r>
           </w:p>
         </w:tc>
@@ -2073,9 +1726,116 @@
         <w:spacing w:before="40"/>
       </w:pPr>
     </w:p>
+    <w:p>
+      <w:pPr>
+        <w:spacing w:before="40"/>
+        <w:rPr>
+          <w:lang w:val="es-ES"/>
+        </w:rPr>
+      </w:pPr>
+      <w:r>
+        <w:rPr>
+          <w:lang w:val="es-ES"/>
+        </w:rPr>
+        <w:t>Proyecto de automatización de pruebas E2E con Playwright, Node.js y JavaScript sobre SauceDemo. Incluye suites Smoke y Regression, seis escenarios QA01–QA06, Page Objects, validaciones funcionales, reporte HTML, capturas y trazas para el diagnóstico de fallos, y documentación de estrategia y liderazgo QA.</w:t>
+      </w:r>
+    </w:p>
+    <w:p>
+      <w:pPr>
+        <w:spacing w:before="40"/>
+        <w:rPr>
+          <w:lang w:val="es-ES"/>
+        </w:rPr>
+      </w:pPr>
+      <w:r>
+        <w:rPr>
+          <w:noProof/>
+        </w:rPr>
+        <w:drawing>
+          <wp:inline distT="0" distB="0" distL="0" distR="0" wp14:anchorId="719815C5" wp14:editId="425C31EC">
+            <wp:extent cx="6766560" cy="1668780"/>
+            <wp:effectExtent l="0" t="0" r="0" b="7620"/>
+            <wp:docPr id="784787212" name="Imagen 1"/>
+            <wp:cNvGraphicFramePr>
+              <a:graphicFrameLocks xmlns:a="http://schemas.openxmlformats.org/drawingml/2006/main" noChangeAspect="1"/>
+            </wp:cNvGraphicFramePr>
+            <a:graphic xmlns:a="http://schemas.openxmlformats.org/drawingml/2006/main">
+              <a:graphicData uri="http://schemas.openxmlformats.org/drawingml/2006/picture">
+                <pic:pic xmlns:pic="http://schemas.openxmlformats.org/drawingml/2006/picture">
+                  <pic:nvPicPr>
+                    <pic:cNvPr id="784787212" name=""/>
+                    <pic:cNvPicPr/>
+                  </pic:nvPicPr>
+                  <pic:blipFill>
+                    <a:blip r:embed="rId14"/>
+                    <a:stretch>
+                      <a:fillRect/>
+                    </a:stretch>
+                  </pic:blipFill>
+                  <pic:spPr>
+                    <a:xfrm>
+                      <a:off x="0" y="0"/>
+                      <a:ext cx="6766560" cy="1668780"/>
+                    </a:xfrm>
+                    <a:prstGeom prst="rect">
+                      <a:avLst/>
+                    </a:prstGeom>
+                  </pic:spPr>
+                </pic:pic>
+              </a:graphicData>
+            </a:graphic>
+          </wp:inline>
+        </w:drawing>
+      </w:r>
+    </w:p>
+    <w:p>
+      <w:pPr>
+        <w:spacing w:before="40"/>
+      </w:pPr>
+      <w:r>
+        <w:rPr>
+          <w:noProof/>
+        </w:rPr>
+        <w:drawing>
+          <wp:inline distT="0" distB="0" distL="0" distR="0" wp14:anchorId="4B3E5453" wp14:editId="4AFBA02B">
+            <wp:extent cx="6766560" cy="3824605"/>
+            <wp:effectExtent l="0" t="0" r="0" b="4445"/>
+            <wp:docPr id="292188875" name="Imagen 1"/>
+            <wp:cNvGraphicFramePr>
+              <a:graphicFrameLocks xmlns:a="http://schemas.openxmlformats.org/drawingml/2006/main" noChangeAspect="1"/>
+            </wp:cNvGraphicFramePr>
+            <a:graphic xmlns:a="http://schemas.openxmlformats.org/drawingml/2006/main">
+              <a:graphicData uri="http://schemas.openxmlformats.org/drawingml/2006/picture">
+                <pic:pic xmlns:pic="http://schemas.openxmlformats.org/drawingml/2006/picture">
+                  <pic:nvPicPr>
+                    <pic:cNvPr id="292188875" name=""/>
+                    <pic:cNvPicPr/>
+                  </pic:nvPicPr>
+                  <pic:blipFill>
+                    <a:blip r:embed="rId15"/>
+                    <a:stretch>
+                      <a:fillRect/>
+                    </a:stretch>
+                  </pic:blipFill>
+                  <pic:spPr>
+                    <a:xfrm>
+                      <a:off x="0" y="0"/>
+                      <a:ext cx="6766560" cy="3824605"/>
+                    </a:xfrm>
+                    <a:prstGeom prst="rect">
+                      <a:avLst/>
+                    </a:prstGeom>
+                  </pic:spPr>
+                </pic:pic>
+              </a:graphicData>
+            </a:graphic>
+          </wp:inline>
+        </w:drawing>
+      </w:r>
+    </w:p>
     <w:sectPr>
-      <w:headerReference w:type="default" r:id="rId14"/>
-      <w:footerReference w:type="default" r:id="rId15"/>
+      <w:headerReference w:type="default" r:id="rId16"/>
+      <w:footerReference w:type="default" r:id="rId17"/>
       <w:pgSz w:w="12240" w:h="15840"/>
       <w:pgMar w:top="691" w:right="792" w:bottom="648" w:left="792" w:header="288" w:footer="288" w:gutter="0"/>
       <w:cols w:space="720"/>
@@ -2117,79 +1877,13 @@
       <w:pStyle w:val="Piedepgina"/>
       <w:jc w:val="center"/>
     </w:pPr>
-    <w:proofErr w:type="spellStart"/>
     <w:r>
       <w:rPr>
         <w:color w:val="646E78"/>
         <w:sz w:val="14"/>
       </w:rPr>
-      <w:t>Estrategia</w:t>
+      <w:t>Estrategia de calidad · SauceDemo · Documento de trabajo</w:t>
     </w:r>
-    <w:proofErr w:type="spellEnd"/>
-    <w:r>
-      <w:rPr>
-        <w:color w:val="646E78"/>
-        <w:sz w:val="14"/>
-      </w:rPr>
-      <w:t xml:space="preserve"> de </w:t>
-    </w:r>
-    <w:proofErr w:type="spellStart"/>
-    <w:r>
-      <w:rPr>
-        <w:color w:val="646E78"/>
-        <w:sz w:val="14"/>
-      </w:rPr>
-      <w:t>calidad</w:t>
-    </w:r>
-    <w:proofErr w:type="spellEnd"/>
-    <w:r>
-      <w:rPr>
-        <w:color w:val="646E78"/>
-        <w:sz w:val="14"/>
-      </w:rPr>
-      <w:t xml:space="preserve"> · </w:t>
-    </w:r>
-    <w:proofErr w:type="spellStart"/>
-    <w:r>
-      <w:rPr>
-        <w:color w:val="646E78"/>
-        <w:sz w:val="14"/>
-      </w:rPr>
-      <w:t>SauceDemo</w:t>
-    </w:r>
-    <w:proofErr w:type="spellEnd"/>
-    <w:r>
-      <w:rPr>
-        <w:color w:val="646E78"/>
-        <w:sz w:val="14"/>
-      </w:rPr>
-      <w:t xml:space="preserve"> · </w:t>
-    </w:r>
-    <w:proofErr w:type="spellStart"/>
-    <w:r>
-      <w:rPr>
-        <w:color w:val="646E78"/>
-        <w:sz w:val="14"/>
-      </w:rPr>
-      <w:t>Documento</w:t>
-    </w:r>
-    <w:proofErr w:type="spellEnd"/>
-    <w:r>
-      <w:rPr>
-        <w:color w:val="646E78"/>
-        <w:sz w:val="14"/>
-      </w:rPr>
-      <w:t xml:space="preserve"> de </w:t>
-    </w:r>
-    <w:proofErr w:type="spellStart"/>
-    <w:r>
-      <w:rPr>
-        <w:color w:val="646E78"/>
-        <w:sz w:val="14"/>
-      </w:rPr>
-      <w:t>trabajo</w:t>
-    </w:r>
-    <w:proofErr w:type="spellEnd"/>
   </w:p>
 </w:ftr>
 </file>
@@ -2226,23 +1920,13 @@
       <w:pStyle w:val="Encabezado"/>
       <w:jc w:val="right"/>
     </w:pPr>
-    <w:proofErr w:type="gramStart"/>
     <w:r>
       <w:rPr>
         <w:b/>
         <w:color w:val="5F6E7D"/>
         <w:sz w:val="14"/>
       </w:rPr>
-      <w:t>HELPPEOPLE  |</w:t>
-    </w:r>
-    <w:proofErr w:type="gramEnd"/>
-    <w:r>
-      <w:rPr>
-        <w:b/>
-        <w:color w:val="5F6E7D"/>
-        <w:sz w:val="14"/>
-      </w:rPr>
-      <w:t xml:space="preserve">  PRUEBA TÉCNICA LÍDER QA</w:t>
+      <w:t>HELPPEOPLE  |  PRUEBA TÉCNICA LÍDER QA</w:t>
     </w:r>
   </w:p>
 </w:hdr>

</xml_diff>